<commit_message>
Informe Unidad 2: indice con paginas y sin nombres
</commit_message>
<xml_diff>
--- a/docs/informes/Informe_Unidad2.docx
+++ b/docs/informes/Informe_Unidad2.docx
@@ -77,40 +77,15 @@
     </w:p>
     <w:p>
       <w:pPr>
-        <w:spacing w:after="100"/>
         <w:jc w:val="center"/>
       </w:pPr>
       <w:r>
         <w:rPr>
-          <w:sz w:val="22"/>
-          <w:szCs w:val="22"/>
-        </w:rPr>
-        <w:t xml:space="preserve">Integrantes: [Integrante 1] · [Integrante 2]</w:t>
-      </w:r>
-    </w:p>
-    <w:p>
-      <w:pPr>
-        <w:spacing w:after="100"/>
-        <w:jc w:val="center"/>
-      </w:pPr>
-      <w:r>
-        <w:rPr>
-          <w:sz w:val="22"/>
-          <w:szCs w:val="22"/>
-        </w:rPr>
-        <w:t xml:space="preserve">Docente: [Nombre del docente]</w:t>
-      </w:r>
-    </w:p>
-    <w:p>
-      <w:pPr>
-        <w:jc w:val="center"/>
-      </w:pPr>
-      <w:r>
-        <w:rPr>
-          <w:sz w:val="22"/>
-          <w:szCs w:val="22"/>
-        </w:rPr>
-        <w:t xml:space="preserve">Santiago, septiembre de 2026</w:t>
+          <w:color w:val="555555"/>
+          <w:sz w:val="22"/>
+          <w:szCs w:val="22"/>
+        </w:rPr>
+        <w:t xml:space="preserve">Documento interno de seguimiento · septiembre de 2026</w:t>
       </w:r>
     </w:p>
     <w:p>
@@ -133,25 +108,431 @@
         <w:t xml:space="preserve">Contenido</w:t>
       </w:r>
     </w:p>
-    <w:sdt>
-      <w:sdtPr>
-        <w:alias w:val="Contenido"/>
-      </w:sdtPr>
-      <w:sdtContent>
-        <w:p>
-          <w:r>
-            <w:fldChar w:fldCharType="begin" w:dirty="true"/>
-            <w:instrText xml:space="preserve">TOC \h \o "1-2"</w:instrText>
-            <w:fldChar w:fldCharType="separate"/>
-          </w:r>
-        </w:p>
-        <w:p>
-          <w:r>
-            <w:fldChar w:fldCharType="end"/>
-          </w:r>
-        </w:p>
-      </w:sdtContent>
-    </w:sdt>
+    <w:p>
+      <w:pPr>
+        <w:tabs>
+          <w:tab w:val="right" w:pos="9360" w:leader="dot"/>
+        </w:tabs>
+        <w:spacing w:after="100"/>
+        <w:ind w:left="0"/>
+      </w:pPr>
+      <w:r>
+        <w:rPr>
+          <w:b/>
+          <w:bCs/>
+          <w:sz w:val="22"/>
+          <w:szCs w:val="22"/>
+        </w:rPr>
+        <w:t xml:space="preserve">1. Introducción</w:t>
+      </w:r>
+      <w:r>
+        <w:rPr>
+          <w:sz w:val="22"/>
+          <w:szCs w:val="22"/>
+        </w:rPr>
+        <w:t xml:space="preserve">	3</w:t>
+      </w:r>
+    </w:p>
+    <w:p>
+      <w:pPr>
+        <w:tabs>
+          <w:tab w:val="right" w:pos="9360" w:leader="dot"/>
+        </w:tabs>
+        <w:spacing w:after="100"/>
+        <w:ind w:left="0"/>
+      </w:pPr>
+      <w:r>
+        <w:rPr>
+          <w:b/>
+          <w:bCs/>
+          <w:sz w:val="22"/>
+          <w:szCs w:val="22"/>
+        </w:rPr>
+        <w:t xml:space="preserve">2. Del prototipo único a varias estructuras</w:t>
+      </w:r>
+      <w:r>
+        <w:rPr>
+          <w:sz w:val="22"/>
+          <w:szCs w:val="22"/>
+        </w:rPr>
+        <w:t xml:space="preserve">	3</w:t>
+      </w:r>
+    </w:p>
+    <w:p>
+      <w:pPr>
+        <w:tabs>
+          <w:tab w:val="right" w:pos="9360" w:leader="dot"/>
+        </w:tabs>
+        <w:spacing w:after="100"/>
+        <w:ind w:left="0"/>
+      </w:pPr>
+      <w:r>
+        <w:rPr>
+          <w:b/>
+          <w:bCs/>
+          <w:sz w:val="22"/>
+          <w:szCs w:val="22"/>
+        </w:rPr>
+        <w:t xml:space="preserve">3. Arquitectura propuesta</w:t>
+      </w:r>
+      <w:r>
+        <w:rPr>
+          <w:sz w:val="22"/>
+          <w:szCs w:val="22"/>
+        </w:rPr>
+        <w:t xml:space="preserve">	3</w:t>
+      </w:r>
+    </w:p>
+    <w:p>
+      <w:pPr>
+        <w:tabs>
+          <w:tab w:val="right" w:pos="9360" w:leader="dot"/>
+        </w:tabs>
+        <w:spacing w:after="100"/>
+        <w:ind w:left="0"/>
+      </w:pPr>
+      <w:r>
+        <w:rPr>
+          <w:b/>
+          <w:bCs/>
+          <w:sz w:val="22"/>
+          <w:szCs w:val="22"/>
+        </w:rPr>
+        <w:t xml:space="preserve">4. Estados del sistema</w:t>
+      </w:r>
+      <w:r>
+        <w:rPr>
+          <w:sz w:val="22"/>
+          <w:szCs w:val="22"/>
+        </w:rPr>
+        <w:t xml:space="preserve">	4</w:t>
+      </w:r>
+    </w:p>
+    <w:p>
+      <w:pPr>
+        <w:tabs>
+          <w:tab w:val="right" w:pos="9360" w:leader="dot"/>
+        </w:tabs>
+        <w:spacing w:after="60"/>
+        <w:ind w:left="400"/>
+      </w:pPr>
+      <w:r>
+        <w:rPr>
+          <w:b w:val="false"/>
+          <w:bCs w:val="false"/>
+          <w:sz w:val="20"/>
+          <w:szCs w:val="20"/>
+        </w:rPr>
+        <w:t xml:space="preserve">4.1 Cómo se distingue un sismo de un daño</w:t>
+      </w:r>
+      <w:r>
+        <w:rPr>
+          <w:sz w:val="20"/>
+          <w:szCs w:val="20"/>
+        </w:rPr>
+        <w:t xml:space="preserve">	5</w:t>
+      </w:r>
+    </w:p>
+    <w:p>
+      <w:pPr>
+        <w:tabs>
+          <w:tab w:val="right" w:pos="9360" w:leader="dot"/>
+        </w:tabs>
+        <w:spacing w:after="60"/>
+        <w:ind w:left="400"/>
+      </w:pPr>
+      <w:r>
+        <w:rPr>
+          <w:b w:val="false"/>
+          <w:bCs w:val="false"/>
+          <w:sz w:val="20"/>
+          <w:szCs w:val="20"/>
+        </w:rPr>
+        <w:t xml:space="preserve">4.2 Por qué el estado gris es necesario</w:t>
+      </w:r>
+      <w:r>
+        <w:rPr>
+          <w:sz w:val="20"/>
+          <w:szCs w:val="20"/>
+        </w:rPr>
+        <w:t xml:space="preserve">	5</w:t>
+      </w:r>
+    </w:p>
+    <w:p>
+      <w:pPr>
+        <w:tabs>
+          <w:tab w:val="right" w:pos="9360" w:leader="dot"/>
+        </w:tabs>
+        <w:spacing w:after="100"/>
+        <w:ind w:left="0"/>
+      </w:pPr>
+      <w:r>
+        <w:rPr>
+          <w:b/>
+          <w:bCs/>
+          <w:sz w:val="22"/>
+          <w:szCs w:val="22"/>
+        </w:rPr>
+        <w:t xml:space="preserve">5. Protocolo de comunicación</w:t>
+      </w:r>
+      <w:r>
+        <w:rPr>
+          <w:sz w:val="22"/>
+          <w:szCs w:val="22"/>
+        </w:rPr>
+        <w:t xml:space="preserve">	5</w:t>
+      </w:r>
+    </w:p>
+    <w:p>
+      <w:pPr>
+        <w:tabs>
+          <w:tab w:val="right" w:pos="9360" w:leader="dot"/>
+        </w:tabs>
+        <w:spacing w:after="100"/>
+        <w:ind w:left="0"/>
+      </w:pPr>
+      <w:r>
+        <w:rPr>
+          <w:b/>
+          <w:bCs/>
+          <w:sz w:val="22"/>
+          <w:szCs w:val="22"/>
+        </w:rPr>
+        <w:t xml:space="preserve">6. Cambios en el firmware</w:t>
+      </w:r>
+      <w:r>
+        <w:rPr>
+          <w:sz w:val="22"/>
+          <w:szCs w:val="22"/>
+        </w:rPr>
+        <w:t xml:space="preserve">	5</w:t>
+      </w:r>
+    </w:p>
+    <w:p>
+      <w:pPr>
+        <w:tabs>
+          <w:tab w:val="right" w:pos="9360" w:leader="dot"/>
+        </w:tabs>
+        <w:spacing w:after="60"/>
+        <w:ind w:left="400"/>
+      </w:pPr>
+      <w:r>
+        <w:rPr>
+          <w:b w:val="false"/>
+          <w:bCs w:val="false"/>
+          <w:sz w:val="20"/>
+          <w:szCs w:val="20"/>
+        </w:rPr>
+        <w:t xml:space="preserve">6.1 Parámetros</w:t>
+      </w:r>
+      <w:r>
+        <w:rPr>
+          <w:sz w:val="20"/>
+          <w:szCs w:val="20"/>
+        </w:rPr>
+        <w:t xml:space="preserve">	6</w:t>
+      </w:r>
+    </w:p>
+    <w:p>
+      <w:pPr>
+        <w:tabs>
+          <w:tab w:val="right" w:pos="9360" w:leader="dot"/>
+        </w:tabs>
+        <w:spacing w:after="60"/>
+        <w:ind w:left="400"/>
+      </w:pPr>
+      <w:r>
+        <w:rPr>
+          <w:b w:val="false"/>
+          <w:bCs w:val="false"/>
+          <w:sz w:val="20"/>
+          <w:szCs w:val="20"/>
+        </w:rPr>
+        <w:t xml:space="preserve">6.2 Verificación de la lógica</w:t>
+      </w:r>
+      <w:r>
+        <w:rPr>
+          <w:sz w:val="20"/>
+          <w:szCs w:val="20"/>
+        </w:rPr>
+        <w:t xml:space="preserve">	6</w:t>
+      </w:r>
+    </w:p>
+    <w:p>
+      <w:pPr>
+        <w:tabs>
+          <w:tab w:val="right" w:pos="9360" w:leader="dot"/>
+        </w:tabs>
+        <w:spacing w:after="100"/>
+        <w:ind w:left="0"/>
+      </w:pPr>
+      <w:r>
+        <w:rPr>
+          <w:b/>
+          <w:bCs/>
+          <w:sz w:val="22"/>
+          <w:szCs w:val="22"/>
+        </w:rPr>
+        <w:t xml:space="preserve">7. Seguridad</w:t>
+      </w:r>
+      <w:r>
+        <w:rPr>
+          <w:sz w:val="22"/>
+          <w:szCs w:val="22"/>
+        </w:rPr>
+        <w:t xml:space="preserve">	6</w:t>
+      </w:r>
+    </w:p>
+    <w:p>
+      <w:pPr>
+        <w:tabs>
+          <w:tab w:val="right" w:pos="9360" w:leader="dot"/>
+        </w:tabs>
+        <w:spacing w:after="60"/>
+        <w:ind w:left="400"/>
+      </w:pPr>
+      <w:r>
+        <w:rPr>
+          <w:b w:val="false"/>
+          <w:bCs w:val="false"/>
+          <w:sz w:val="20"/>
+          <w:szCs w:val="20"/>
+        </w:rPr>
+        <w:t xml:space="preserve">7.1 Recalibración protegida</w:t>
+      </w:r>
+      <w:r>
+        <w:rPr>
+          <w:sz w:val="20"/>
+          <w:szCs w:val="20"/>
+        </w:rPr>
+        <w:t xml:space="preserve">	7</w:t>
+      </w:r>
+    </w:p>
+    <w:p>
+      <w:pPr>
+        <w:tabs>
+          <w:tab w:val="right" w:pos="9360" w:leader="dot"/>
+        </w:tabs>
+        <w:spacing w:after="60"/>
+        <w:ind w:left="400"/>
+      </w:pPr>
+      <w:r>
+        <w:rPr>
+          <w:b w:val="false"/>
+          <w:bCs w:val="false"/>
+          <w:sz w:val="20"/>
+          <w:szCs w:val="20"/>
+        </w:rPr>
+        <w:t xml:space="preserve">7.2 Autenticación y datos</w:t>
+      </w:r>
+      <w:r>
+        <w:rPr>
+          <w:sz w:val="20"/>
+          <w:szCs w:val="20"/>
+        </w:rPr>
+        <w:t xml:space="preserve">	7</w:t>
+      </w:r>
+    </w:p>
+    <w:p>
+      <w:pPr>
+        <w:tabs>
+          <w:tab w:val="right" w:pos="9360" w:leader="dot"/>
+        </w:tabs>
+        <w:spacing w:after="60"/>
+        <w:ind w:left="400"/>
+      </w:pPr>
+      <w:r>
+        <w:rPr>
+          <w:b w:val="false"/>
+          <w:bCs w:val="false"/>
+          <w:sz w:val="20"/>
+          <w:szCs w:val="20"/>
+        </w:rPr>
+        <w:t xml:space="preserve">7.3 Permisos en Android</w:t>
+      </w:r>
+      <w:r>
+        <w:rPr>
+          <w:sz w:val="20"/>
+          <w:szCs w:val="20"/>
+        </w:rPr>
+        <w:t xml:space="preserve">	7</w:t>
+      </w:r>
+    </w:p>
+    <w:p>
+      <w:pPr>
+        <w:tabs>
+          <w:tab w:val="right" w:pos="9360" w:leader="dot"/>
+        </w:tabs>
+        <w:spacing w:after="100"/>
+        <w:ind w:left="0"/>
+      </w:pPr>
+      <w:r>
+        <w:rPr>
+          <w:b/>
+          <w:bCs/>
+          <w:sz w:val="22"/>
+          <w:szCs w:val="22"/>
+        </w:rPr>
+        <w:t xml:space="preserve">8. Diseño de la aplicación</w:t>
+      </w:r>
+      <w:r>
+        <w:rPr>
+          <w:sz w:val="22"/>
+          <w:szCs w:val="22"/>
+        </w:rPr>
+        <w:t xml:space="preserve">	7</w:t>
+      </w:r>
+    </w:p>
+    <w:p>
+      <w:pPr>
+        <w:tabs>
+          <w:tab w:val="right" w:pos="9360" w:leader="dot"/>
+        </w:tabs>
+        <w:spacing w:after="100"/>
+        <w:ind w:left="0"/>
+      </w:pPr>
+      <w:r>
+        <w:rPr>
+          <w:b/>
+          <w:bCs/>
+          <w:sz w:val="22"/>
+          <w:szCs w:val="22"/>
+        </w:rPr>
+        <w:t xml:space="preserve">9. Herramientas de desarrollo</w:t>
+      </w:r>
+      <w:r>
+        <w:rPr>
+          <w:sz w:val="22"/>
+          <w:szCs w:val="22"/>
+        </w:rPr>
+        <w:t xml:space="preserve">	8</w:t>
+      </w:r>
+    </w:p>
+    <w:p>
+      <w:pPr>
+        <w:tabs>
+          <w:tab w:val="right" w:pos="9360" w:leader="dot"/>
+        </w:tabs>
+        <w:spacing w:after="100"/>
+        <w:ind w:left="0"/>
+      </w:pPr>
+      <w:r>
+        <w:rPr>
+          <w:b/>
+          <w:bCs/>
+          <w:sz w:val="22"/>
+          <w:szCs w:val="22"/>
+        </w:rPr>
+        <w:t xml:space="preserve">10. Estado del proyecto y próximos pasos</w:t>
+      </w:r>
+      <w:r>
+        <w:rPr>
+          <w:sz w:val="22"/>
+          <w:szCs w:val="22"/>
+        </w:rPr>
+        <w:t xml:space="preserve">	9</w:t>
+      </w:r>
+    </w:p>
     <w:p>
       <w:r>
         <w:br w:type="page"/>

</xml_diff>